<commit_message>
fix(curadoria): corrige descricoes do catalogo 02 e registra retroalimentacao
</commit_message>
<xml_diff>
--- a/02_Sistemas_de_Numeracao/02_Catalogo_Semantico.docx
+++ b/02_Sistemas_de_Numeracao/02_Catalogo_Semantico.docx
@@ -155,7 +155,7 @@
     </w:p>
     <w:p>
       <w:r>
-        <w:t>Conteúdo apresentado: Apresenta o crescimento do número de combinações de n bits pela expressão 2ⁿ. Exemplifica os casos de 1, 2 e 3 bits, chegando à fórmula geral e distinguindo quantidade de combinações de valor máximo.</w:t>
+        <w:t>Conteúdo apresentado: Apresenta o crescimento do número de combinações de n bits pela expressão 2ⁿ. Exemplifica os casos de 1, 2 e 3 bits, chegando à fórmula geral e mostrando que cada bit adicional duplica o número de combinações.</w:t>
       </w:r>
     </w:p>
     <w:p>
@@ -295,12 +295,12 @@
     </w:p>
     <w:p>
       <w:r>
-        <w:t>Conteúdo apresentado: Contrasta tipos inteiros com e sem sinal em C e demonstra que a mesma sequência de bits pode representar números diferentes. Ilustra a leitura de 11111111 como 255 em unsigned e −1 em signed de 8 bits.</w:t>
+        <w:t>Conteúdo apresentado: Contrasta interpretações com e sem sinal e demonstra que a mesma sequência de bits pode representar números diferentes. Ilustra a leitura de 1010 como 10 em unsigned e −6 em signed, em complemento de dois, no modelo didático de quatro bits; relaciona a interpretação aos tipos inteiros em C.</w:t>
       </w:r>
     </w:p>
     <w:p>
       <w:r>
-        <w:t>Representação e exemplos: Trechos de código, representação visual de oito bits e saída de terminal.</w:t>
+        <w:t>Representação e exemplos: Diagramas de quatro bits com setas, cálculo com peso negativo do MSB, tabelas comparativas de valores e faixas, e declarações signed char e unsigned char acompanhadas da ressalva do modelo didático de quatro bits.</w:t>
       </w:r>
     </w:p>
     <w:p>
@@ -326,7 +326,7 @@
     </w:p>
     <w:p>
       <w:r>
-        <w:t>Conteúdo apresentado: Compara a interpretação dos mesmos oito bits como unsigned e signed. Ao longo da animação, a representação binária permanece igual, mas o resultado numérico com sinal muda conforme a interpretação em complemento de dois.</w:t>
+        <w:t>Conteúdo apresentado: Compara dois objetos de oito bits: unsigned char com valor 255 e signed char com valor −1, no modelo de complemento de dois. A animação apresenta progressivamente as representações, iguais a 11111111 quando ambas estão exibidas, destaca as linhas de código e acrescenta as saídas unsigned: 255 e signed: -1 ao terminal; os valores dos objetos não mudam.</w:t>
       </w:r>
     </w:p>
     <w:p>

</xml_diff>